<commit_message>
Update project reports with description of sequential flash writes
</commit_message>
<xml_diff>
--- a/Bao_Cao_Flappy_Bird.docx
+++ b/Bao_Cao_Flappy_Bird.docx
@@ -1547,7 +1547,7 @@
         <w:t>Game_Init</w:t>
       </w:r>
       <w:r>
-        <w:t xml:space="preserve">), vi điều khiển đọc giá trị 32-bit từ địa chỉ </w:t>
+        <w:t xml:space="preserve">), vi điều khiển duyệt qua sector 128KB (32768 từ 32-bit) từ địa chỉ gốc </w:t>
       </w:r>
       <w:r>
         <w:rPr>
@@ -1558,7 +1558,7 @@
         <w:t>0x081E0000</w:t>
       </w:r>
       <w:r>
-        <w:t xml:space="preserve">. Nếu vùng nhớ này chưa từng được ghi (giá trị mặc định là </w:t>
+        <w:t xml:space="preserve"> để tìm vị trí ô trống đầu tiên (chứa giá trị </w:t>
       </w:r>
       <w:r>
         <w:rPr>
@@ -1569,7 +1569,7 @@
         <w:t>0xFFFFFFFF</w:t>
       </w:r>
       <w:r>
-        <w:t xml:space="preserve">), điểm số kỷ lục sẽ được gán bằng 0. Ngược lại, điểm số cũ được tải vào biến </w:t>
+        <w:t xml:space="preserve">). Điểm số kỷ lục ghi gần đây nhất (ở ô nhớ ngay trước ô trống) sẽ được tải vào biến </w:t>
       </w:r>
       <w:r>
         <w:rPr>
@@ -1580,7 +1580,7 @@
         <w:t>g_best</w:t>
       </w:r>
       <w:r>
-        <w:t>.</w:t>
+        <w:t>. Nếu sector trống hoàn toàn, điểm số kỷ lục được đặt bằng 0.</w:t>
       </w:r>
     </w:p>
     <w:p>
@@ -1595,7 +1595,7 @@
         <w:t>Hàm `save_best_score(uint32_t score)`</w:t>
       </w:r>
       <w:r>
-        <w:t>: Khi người chơi va chạm và chết, nếu điểm hiện tại cao hơn kỷ lục cũ:</w:t>
+        <w:t>: Khi người chơi va chạm và đạt kỷ lục mới:</w:t>
       </w:r>
     </w:p>
     <w:p>
@@ -1622,7 +1622,15 @@
         <w:pStyle w:val="ListNumber"/>
       </w:pPr>
       <w:r>
-        <w:t xml:space="preserve">Thực hiện xóa Sector 23 bằng hàm </w:t>
+        <w:t>Tìm vị trí ô trống đầu tiên trong sector.</w:t>
+      </w:r>
+    </w:p>
+    <w:p>
+      <w:pPr>
+        <w:pStyle w:val="ListNumber"/>
+      </w:pPr>
+      <w:r>
+        <w:t xml:space="preserve">Nếu sector đã đầy (duyệt hết 128KB mà không còn ô trống), tiến hành xóa Sector 23 bằng hàm </w:t>
       </w:r>
       <w:r>
         <w:rPr>
@@ -1633,7 +1641,7 @@
         <w:t>HAL_FLASHEx_Erase</w:t>
       </w:r>
       <w:r>
-        <w:t>.</w:t>
+        <w:t xml:space="preserve"> rồi ghi điểm số mới vào địa chỉ gốc.</w:t>
       </w:r>
     </w:p>
     <w:p>
@@ -1641,18 +1649,7 @@
         <w:pStyle w:val="ListNumber"/>
       </w:pPr>
       <w:r>
-        <w:t xml:space="preserve">Ghi điểm số mới dưới dạng từ 32-bit (Word) vào địa chỉ </w:t>
-      </w:r>
-      <w:r>
-        <w:rPr>
-          <w:rFonts w:ascii="Courier New" w:hAnsi="Courier New"/>
-          <w:color w:val="9A0515"/>
-          <w:sz w:val="20"/>
-        </w:rPr>
-        <w:t>0x081E0000</w:t>
-      </w:r>
-      <w:r>
-        <w:t xml:space="preserve"> thông qua </w:t>
+        <w:t xml:space="preserve">Nếu sector còn ô trống, ghi tuần tự điểm số mới vào ô trống tiếp theo bằng </w:t>
       </w:r>
       <w:r>
         <w:rPr>
@@ -1663,7 +1660,16 @@
         <w:t>HAL_FLASH_Program</w:t>
       </w:r>
       <w:r>
-        <w:t>.</w:t>
+        <w:t xml:space="preserve"> (quá trình chỉ mất khoảng </w:t>
+      </w:r>
+      <w:r>
+        <w:rPr>
+          <w:b/>
+        </w:rPr>
+        <w:t>16 microseconds</w:t>
+      </w:r>
+      <w:r>
+        <w:t>, hoàn toàn loại bỏ hiện tượng đứng hình/khựng game 1-2 giây thường thấy khi xóa sector).</w:t>
       </w:r>
     </w:p>
     <w:p>

</xml_diff>